<commit_message>
feat: trava de cancelamento, contrato modelo, documentos de comissão e materiais por usuário (v1.14.0)
- Cancelar contrato/cobrança/recibo: só admin, com step-up da senha de login (5 erros = 15 min);
  corretor/secretária solicitam (sininho + push só do admin); auditoria imutável (gatilhos MySQL);
  cancelar libera a chácara (aviso de lote liberado) e cancela cobranças futuras no Asaas
- Contrato modelo: minuta do CPCV com cliente fictício e anexos, gerada na hora, sem gravar nada
- CPCV: cláusula 19.1.2 (2% do corretor pagos no sinal, retidos na desistência); Contrato de
  Intermediação Imobiliária (cliente) anexado; Contrato de Comissão Empreendedora x Romatec (só admin)
- Cartão de vendas por usuário (proposta, folder, links ?c=, WhatsApp): empreendedor usa o do admin

Co-Authored-By: Claude Opus 5.5 <noreply@anthropic.com>
</commit_message>
<xml_diff>
--- a/templates/MODELO-CPCV-BOM-JARDIMS-v2.docx
+++ b/templates/MODELO-CPCV-BOM-JARDIMS-v2.docx
@@ -1489,6 +1489,63 @@
               </w:rPr>
               <w:t>, retida de 50% no 1º e 50% no 2º pagamento da entrada (Cláusula 19ª)</w:t>
             </w:r>
+            <w:r>
+              <w:rPr>
+                <w:rFonts w:ascii="Times New Roman" w:hAnsi="Times New Roman"/>
+                <w:b w:val="0"/>
+              </w:rPr>
+              <w:t xml:space="preserve">; dela, </w:t>
+            </w:r>
+            <w:r>
+              <w:rPr>
+                <w:rFonts w:ascii="Times New Roman" w:hAnsi="Times New Roman"/>
+                <w:b w:val="0"/>
+                <w:color w:val="1F4E9A"/>
+              </w:rPr>
+              <w:t xml:space="preserve">{{intermed_comissao_pct}}</w:t>
+            </w:r>
+            <w:r>
+              <w:rPr>
+                <w:rFonts w:ascii="Times New Roman" w:hAnsi="Times New Roman"/>
+                <w:b w:val="0"/>
+              </w:rPr>
+              <w:t xml:space="preserve"> (R$ </w:t>
+            </w:r>
+            <w:r>
+              <w:rPr>
+                <w:rFonts w:ascii="Times New Roman" w:hAnsi="Times New Roman"/>
+                <w:b w:val="0"/>
+                <w:color w:val="1F4E9A"/>
+              </w:rPr>
+              <w:t xml:space="preserve">{{intermed_comissao_valor}}</w:t>
+            </w:r>
+            <w:r>
+              <w:rPr>
+                <w:rFonts w:ascii="Times New Roman" w:hAnsi="Times New Roman"/>
+                <w:b w:val="0"/>
+              </w:rPr>
+              <w:t xml:space="preserve">) remuneram o(a) corretor(a) intermediador(a), pagos no ato do sinal e </w:t>
+            </w:r>
+            <w:r>
+              <w:rPr>
+                <w:rFonts w:ascii="Times New Roman" w:hAnsi="Times New Roman"/>
+                <w:b/>
+              </w:rPr>
+              <w:t xml:space="preserve">não restituíveis na desistência do(a) COMPRADOR(A)</w:t>
+            </w:r>
+            <w:r>
+              <w:rPr>
+                <w:rFonts w:ascii="Times New Roman" w:hAnsi="Times New Roman"/>
+                <w:b w:val="0"/>
+              </w:rPr>
+              <w:t xml:space="preserve"> (Cláusula 19.1.2)</w:t>
+            </w:r>
+            <w:r>
+              <w:rPr>
+                <w:rFonts w:ascii="Times New Roman" w:hAnsi="Times New Roman"/>
+              </w:rPr>
+              <w:t xml:space="preserve"/>
+            </w:r>
           </w:p>
         </w:tc>
       </w:tr>
@@ -5526,6 +5583,99 @@
       <w:r>
         <w:rPr>
           <w:rFonts w:ascii="Times New Roman" w:hAnsi="Times New Roman"/>
+          <w:b/>
+        </w:rPr>
+        <w:t xml:space="preserve">19.1.2. DA PARTE DO CORRETOR INTERMEDIADOR E DA SUA RETENÇÃO. </w:t>
+      </w:r>
+      <w:r>
+        <w:rPr>
+          <w:rFonts w:ascii="Times New Roman" w:hAnsi="Times New Roman"/>
+          <w:b/>
+        </w:rPr>
+        <w:t xml:space="preserve">Da corretagem do item 14 do Quadro-Resumo, o valor equivalente a </w:t>
+      </w:r>
+      <w:r>
+        <w:rPr>
+          <w:rFonts w:ascii="Times New Roman" w:hAnsi="Times New Roman"/>
+          <w:b/>
+          <w:color w:val="1F4E9A"/>
+        </w:rPr>
+        <w:t xml:space="preserve">{{intermed_comissao_pct}}</w:t>
+      </w:r>
+      <w:r>
+        <w:rPr>
+          <w:rFonts w:ascii="Times New Roman" w:hAnsi="Times New Roman"/>
+          <w:b/>
+        </w:rPr>
+        <w:t xml:space="preserve"> do valor da venda, ou seja, </w:t>
+      </w:r>
+      <w:r>
+        <w:rPr>
+          <w:rFonts w:ascii="Times New Roman" w:hAnsi="Times New Roman"/>
+          <w:b/>
+          <w:color w:val="1F4E9A"/>
+        </w:rPr>
+        <w:t xml:space="preserve">R$ {{intermed_comissao_valor}} ({{intermed_comissao_extenso}})</w:t>
+      </w:r>
+      <w:r>
+        <w:rPr>
+          <w:rFonts w:ascii="Times New Roman" w:hAnsi="Times New Roman"/>
+          <w:b/>
+        </w:rPr>
+        <w:t xml:space="preserve">, remunera o(a) corretor(a) intermediador(a) </w:t>
+      </w:r>
+      <w:r>
+        <w:rPr>
+          <w:rFonts w:ascii="Times New Roman" w:hAnsi="Times New Roman"/>
+          <w:b/>
+          <w:color w:val="1F4E9A"/>
+        </w:rPr>
+        <w:t xml:space="preserve">{{intermed_nome}}</w:t>
+      </w:r>
+      <w:r>
+        <w:rPr>
+          <w:rFonts w:ascii="Times New Roman" w:hAnsi="Times New Roman"/>
+          <w:b/>
+        </w:rPr>
+        <w:t xml:space="preserve">, CRECI/</w:t>
+      </w:r>
+      <w:r>
+        <w:rPr>
+          <w:rFonts w:ascii="Times New Roman" w:hAnsi="Times New Roman"/>
+          <w:b/>
+          <w:color w:val="1F4E9A"/>
+        </w:rPr>
+        <w:t xml:space="preserve">{{intermed_creci}}</w:t>
+      </w:r>
+      <w:r>
+        <w:rPr>
+          <w:rFonts w:ascii="Times New Roman" w:hAnsi="Times New Roman"/>
+          <w:b/>
+        </w:rPr>
+        <w:t xml:space="preserve">, e é pago e extraído NO ATO DO SINAL (primeiro pagamento da entrada ou pagamento à vista). O(A) COMPRADOR(A) declara que foi informado(a) previamente e em destaque de que esse valor remunera a intermediação já concluída com a celebração deste contrato e, por isso, </w:t>
+      </w:r>
+      <w:r>
+        <w:rPr>
+          <w:rFonts w:ascii="Times New Roman" w:hAnsi="Times New Roman"/>
+          <w:b/>
+        </w:rPr>
+        <w:t xml:space="preserve">NÃO SERÁ RESTITUÍDO NEM ESTORNADO em caso de desistência, de distrato a seu pedido ou de resolução por seu inadimplemento, ficando RETIDO</w:t>
+      </w:r>
+      <w:r>
+        <w:rPr>
+          <w:rFonts w:ascii="Times New Roman" w:hAnsi="Times New Roman"/>
+          <w:b w:val="0"/>
+        </w:rPr>
+        <w:t xml:space="preserve"> (Código Civil, art. 725; Lei n.º 6.766/1979, art. 32-A, V). Ficam ressalvadas apenas as hipóteses em que a lei assegura a devolução integral, inclusive da corretagem: o arrependimento no prazo legal (Cláusula 10ª; CDC, art. 49) e a resolução por culpa da VENDEDORA (Cláusula 11.4). A ciência deste item é reiterada no Contrato de Intermediação Imobiliária assinado pelo(a) COMPRADOR(A) junto com este instrumento.</w:t>
+      </w:r>
+    </w:p>
+    <w:p>
+      <w:pPr>
+        <w:jc w:val="both"/>
+      </w:pPr>
+      <w:r>
+        <w:rPr>
+          <w:rFonts w:ascii="Times New Roman" w:hAnsi="Times New Roman"/>
           <w:b w:val="0"/>
         </w:rPr>
         <w:t xml:space="preserve">19.2. Fica a </w:t>

</xml_diff>

<commit_message>
feat(contratos): CPCV com a gestora (conta Asaas) recebendo por conta e ordem da vendedora (v1.27.1)
- Cláusulas 4.1, 4.2, 4.4 e 19.3 reescritas (scripts/cpcv-recebedora.cjs, idempotente)
- {{pag_recebedor_nome}}/{{pag_recebedor_doc}} do titular da conta Asaas (beneficiarioDoEmpreendimento); definitivo exige a conta configurada

Co-Authored-By: Claude Opus 5.5 <noreply@anthropic.com>
</commit_message>
<xml_diff>
--- a/templates/MODELO-CPCV-BOM-JARDIMS-v2.docx
+++ b/templates/MODELO-CPCV-BOM-JARDIMS-v2.docx
@@ -4270,21 +4270,21 @@
           <w:rFonts w:ascii="Times New Roman" w:hAnsi="Times New Roman"/>
           <w:b w:val="0"/>
         </w:rPr>
-        <w:t xml:space="preserve">4.1. Os pagamentos são feitos exclusivamente por </w:t>
+        <w:t xml:space="preserve">4.1. Os pagamentos são feitos exclusivamente por boleto bancário ou PIX emitidos por {{pag_recebedor_nome}} ({{pag_recebedor_doc}}), gestora de vendas e administradora dos recebíveis do empreendimento, que os recebe por conta e ordem da VENDEDORA na plataforma de pagamentos {{emp_plataforma_pagamento}}, reunidos em carnê entregue ao(à) COMPRADOR(A) em meio físico ou digital (e-mail e WhatsApp informados no preâmbulo). O carnê pode ser emitido em lotes anuais de 12 (doze) parcelas, sem custo para o(a) COMPRADOR(A).</w:t>
       </w:r>
       <w:r>
         <w:rPr>
           <w:rFonts w:ascii="Times New Roman" w:hAnsi="Times New Roman"/>
           <w:b/>
         </w:rPr>
-        <w:t>boleto bancário ou PIX</w:t>
-      </w:r>
-      <w:r>
-        <w:rPr>
-          <w:rFonts w:ascii="Times New Roman" w:hAnsi="Times New Roman"/>
-          <w:b w:val="0"/>
-        </w:rPr>
-        <w:t xml:space="preserve"> emitidos em nome da VENDEDORA pela plataforma de pagamentos por ela contratada (</w:t>
+        <w:t/>
+      </w:r>
+      <w:r>
+        <w:rPr>
+          <w:rFonts w:ascii="Times New Roman" w:hAnsi="Times New Roman"/>
+          <w:b w:val="0"/>
+        </w:rPr>
+        <w:t/>
       </w:r>
       <w:r>
         <w:rPr>
@@ -4292,14 +4292,14 @@
           <w:b w:val="0"/>
           <w:color w:val="1F4E9A"/>
         </w:rPr>
-        <w:t>{{emp_plataforma_pagamento}}</w:t>
-      </w:r>
-      <w:r>
-        <w:rPr>
-          <w:rFonts w:ascii="Times New Roman" w:hAnsi="Times New Roman"/>
-          <w:b w:val="0"/>
-        </w:rPr>
-        <w:t>), reunidos em carnê entregue ao(à) COMPRADOR(A) em meio físico ou digital (e-mail e WhatsApp informados no preâmbulo). O carnê pode ser emitido em lotes anuais de 12 (doze) parcelas, sem custo para o(a) COMPRADOR(A).</w:t>
+        <w:t/>
+      </w:r>
+      <w:r>
+        <w:rPr>
+          <w:rFonts w:ascii="Times New Roman" w:hAnsi="Times New Roman"/>
+          <w:b w:val="0"/>
+        </w:rPr>
+        <w:t/>
       </w:r>
     </w:p>
     <w:p>
@@ -4311,21 +4311,21 @@
           <w:rFonts w:ascii="Times New Roman" w:hAnsi="Times New Roman"/>
           <w:b w:val="0"/>
         </w:rPr>
-        <w:t xml:space="preserve">4.2. </w:t>
+        <w:t xml:space="preserve">4.2. É vedado o pagamento em espécie ou em conta de corretores ou de quaisquer terceiros que não a recebedora indicada no item 4.1. Pagamento feito de forma diversa não libera o(a) COMPRADOR(A), salvo se o valor for comprovadamente creditado na conta da recebedora indicada no item 4.1.</w:t>
       </w:r>
       <w:r>
         <w:rPr>
           <w:rFonts w:ascii="Times New Roman" w:hAnsi="Times New Roman"/>
           <w:b/>
         </w:rPr>
-        <w:t>É vedado o pagamento em espécie ou o depósito em conta da INTERMEDIADORA, de corretores ou de terceiros.</w:t>
-      </w:r>
-      <w:r>
-        <w:rPr>
-          <w:rFonts w:ascii="Times New Roman" w:hAnsi="Times New Roman"/>
-          <w:b w:val="0"/>
-        </w:rPr>
-        <w:t xml:space="preserve"> Pagamento feito de forma diversa não libera o(a) COMPRADOR(A), salvo se o valor for comprovadamente creditado à VENDEDORA.</w:t>
+        <w:t/>
+      </w:r>
+      <w:r>
+        <w:rPr>
+          <w:rFonts w:ascii="Times New Roman" w:hAnsi="Times New Roman"/>
+          <w:b w:val="0"/>
+        </w:rPr>
+        <w:t/>
       </w:r>
     </w:p>
     <w:p>
@@ -4349,7 +4349,7 @@
           <w:rFonts w:ascii="Times New Roman" w:hAnsi="Times New Roman"/>
           <w:b w:val="0"/>
         </w:rPr>
-        <w:t>4.4. A compensação do pagamento confirmada pela plataforma vale como recibo. A quitação de uma parcela não presume a das anteriores, ficando afastada a presunção do art. 322 do Código Civil.</w:t>
+        <w:t xml:space="preserve">4.4. A compensação do pagamento confirmada pela plataforma vale como recibo, sem prejuízo do recibo emitido pela gestora em nome da VENDEDORA. A quitação de uma parcela não presume a das anteriores, ficando afastada a presunção do art. 322 do Código Civil.</w:t>
       </w:r>
     </w:p>
     <w:p>
@@ -5719,21 +5719,21 @@
           <w:rFonts w:ascii="Times New Roman" w:hAnsi="Times New Roman"/>
           <w:b w:val="0"/>
         </w:rPr>
-        <w:t xml:space="preserve">19.3. </w:t>
+        <w:t xml:space="preserve">19.3. A ROMATEC CONSULTORIA TOTAL recebe as parcelas do preço exclusivamente na qualidade de gestora de cobrança e administradora dos recebíveis, por conta e ordem da VENDEDORA (Código Civil, arts. 653 e seguintes), e as repassa à VENDEDORA nos termos do contrato de gestão firmado entre elas. Os recibos das parcelas são emitidos pela gestora em nome da VENDEDORA; a quitação final do preço é dada pela VENDEDORA (Cláusula 17ª), e a gestora não transige em nome das partes. Fora a cobrança, sua atuação limita-se à intermediação, ao assessoramento técnico e à tramitação documental.</w:t>
       </w:r>
       <w:r>
         <w:rPr>
           <w:rFonts w:ascii="Times New Roman" w:hAnsi="Times New Roman"/>
           <w:b/>
         </w:rPr>
-        <w:t>A INTERMEDIADORA não recebe valores do preço, não dá quitação e não transige em nome das partes</w:t>
-      </w:r>
-      <w:r>
-        <w:rPr>
-          <w:rFonts w:ascii="Times New Roman" w:hAnsi="Times New Roman"/>
-          <w:b w:val="0"/>
-        </w:rPr>
-        <w:t>; sua atuação limita-se à intermediação, ao assessoramento técnico e à tramitação documental.</w:t>
+        <w:t/>
+      </w:r>
+      <w:r>
+        <w:rPr>
+          <w:rFonts w:ascii="Times New Roman" w:hAnsi="Times New Roman"/>
+          <w:b w:val="0"/>
+        </w:rPr>
+        <w:t/>
       </w:r>
     </w:p>
     <w:p>

</xml_diff>